<commit_message>
Partido confirmado: Somos Peru en portada, footer, discurso (web/PDF/Word) y llamado al voto (marca el corazon de Somos Peru)
</commit_message>
<xml_diff>
--- a/docs/Discurso_Oscar_Mena_Cutervo_v1.docx
+++ b/docs/Discurso_Oscar_Mena_Cutervo_v1.docx
@@ -73,7 +73,7 @@
           <w:color w:val="124A8F"/>
           <w:sz w:val="28"/>
         </w:rPr>
-        <w:t>Óscar Mena Vílchez · Candidato a la Alcaldía Provincial de Cutervo</w:t>
+        <w:t>Óscar Mena Vílchez · Candidato de Somos Perú a la Alcaldía Provincial de Cutervo</w:t>
       </w:r>
     </w:p>
     <w:p>
@@ -1287,7 +1287,7 @@
           <w:i w:val="0"/>
           <w:sz w:val="23"/>
         </w:rPr>
-        <w:t xml:space="preserve">Soy Óscar Mena Vílchez. </w:t>
+        <w:t xml:space="preserve">Soy Óscar Mena Vílchez, de </w:t>
       </w:r>
       <w:r>
         <w:rPr>
@@ -1295,7 +1295,23 @@
           <w:i w:val="0"/>
           <w:sz w:val="23"/>
         </w:rPr>
-        <w:t>[Marca el símbolo / número …]</w:t>
+        <w:t>Somos Perú</w:t>
+      </w:r>
+      <w:r>
+        <w:rPr>
+          <w:b w:val="0"/>
+          <w:i w:val="0"/>
+          <w:sz w:val="23"/>
+        </w:rPr>
+        <w:t xml:space="preserve">. El cuatro de octubre, </w:t>
+      </w:r>
+      <w:r>
+        <w:rPr>
+          <w:b/>
+          <w:i w:val="0"/>
+          <w:sz w:val="23"/>
+        </w:rPr>
+        <w:t>marca el corazón de Somos Perú</w:t>
       </w:r>
       <w:r>
         <w:rPr>
@@ -1357,7 +1373,23 @@
           <w:i w:val="0"/>
           <w:sz w:val="23"/>
         </w:rPr>
-        <w:t>, candidato a la alcaldía provincial de Cutervo, y vengo con números, no con cuentos.</w:t>
+        <w:t xml:space="preserve">, candidato de </w:t>
+      </w:r>
+      <w:r>
+        <w:rPr>
+          <w:b/>
+          <w:i w:val="0"/>
+          <w:sz w:val="23"/>
+        </w:rPr>
+        <w:t>Somos Perú</w:t>
+      </w:r>
+      <w:r>
+        <w:rPr>
+          <w:b w:val="0"/>
+          <w:i w:val="0"/>
+          <w:sz w:val="23"/>
+        </w:rPr>
+        <w:t xml:space="preserve"> a la alcaldía provincial de Cutervo, y vengo con números, no con cuentos.</w:t>
       </w:r>
     </w:p>
     <w:p>
@@ -1609,7 +1641,7 @@
           <w:i w:val="0"/>
           <w:sz w:val="23"/>
         </w:rPr>
-        <w:t>[símbolo / número]</w:t>
+        <w:t>marca el corazón de Somos Perú</w:t>
       </w:r>
       <w:r>
         <w:rPr>

</xml_diff>